<commit_message>
Redesign Nithin's architecture diagram to be visually distinct from Sachin's
Project 22's figure uses a cyan/amber/slate palette, rounded rectangles,
and a two-row left-to-right grid layout. Rebuilt project 15's figure
with a genuinely different visual language instead of just different
labels on the same shapes: navy/coral/olive palette, fully-rounded pill
nodes, and a single top-to-bottom vertical flow with numbered step
badges rather than a row grid.

Also added a portfolio-wide .gitignore rule for test-run output/
coverage artifacts (coverage/, .nyc_output/, test-results, junit.xml) --
confirmed none were already tracked, so this is a going-forward rule
only and does not touch the *.test.js suites themselves or any existing
CI workflow.

Re-validated against the template XSD and visually re-inspected all 6
pages of the report; still 6 pages, all content reflowed cleanly around
the taller figure.
</commit_message>
<xml_diff>
--- a/documents/Nithin_X25125338/report.docx
+++ b/documents/Nithin_X25125338/report.docx
@@ -614,7 +614,7 @@
       <w:r>
         <w:drawing>
           <wp:inline distT="0" distB="0" distL="0" distR="0">
-            <wp:extent cx="5943600" cy="3891280"/>
+            <wp:extent cx="3840480" cy="5321846"/>
             <wp:effectExtent l="0" t="0" r="0" b="0"/>
             <wp:docPr id="1" name="Picture 1"/>
             <wp:cNvGraphicFramePr>
@@ -636,7 +636,7 @@
                   <pic:spPr>
                     <a:xfrm>
                       <a:off x="0" y="0"/>
-                      <a:ext cx="5943600" cy="3891280"/>
+                      <a:ext cx="3840480" cy="5321846"/>
                     </a:xfrm>
                     <a:prstGeom prst="rect">
                       <a:avLst/>

</xml_diff>